<commit_message>
fix:pre unduh KAK, tgl diterima surat masuk, menu KAK lainnya, generate KAK sisanya
</commit_message>
<xml_diff>
--- a/public/kak-honor-mitra.docx
+++ b/public/kak-honor-mitra.docx
@@ -4480,16 +4480,16 @@
         <w:tblLook w:val="04A0" w:firstRow="1" w:lastRow="0" w:firstColumn="1" w:lastColumn="0" w:noHBand="0" w:noVBand="1"/>
       </w:tblPr>
       <w:tblGrid>
-        <w:gridCol w:w="573"/>
-        <w:gridCol w:w="1712"/>
-        <w:gridCol w:w="2138"/>
+        <w:gridCol w:w="1391"/>
+        <w:gridCol w:w="1654"/>
+        <w:gridCol w:w="1875"/>
         <w:gridCol w:w="1623"/>
         <w:gridCol w:w="1684"/>
-        <w:gridCol w:w="1537"/>
-        <w:gridCol w:w="2016"/>
-        <w:gridCol w:w="2117"/>
+        <w:gridCol w:w="1402"/>
+        <w:gridCol w:w="1852"/>
+        <w:gridCol w:w="2096"/>
         <w:gridCol w:w="2125"/>
-        <w:gridCol w:w="1888"/>
+        <w:gridCol w:w="1711"/>
       </w:tblGrid>
       <w:tr>
         <w:trPr>
@@ -4957,7 +4957,33 @@
                 <w:sz w:val="22"/>
                 <w:szCs w:val="22"/>
               </w:rPr>
-              <w:t>1.</w:t>
+              <w:t>${</w:t>
+            </w:r>
+            <w:proofErr w:type="spellStart"/>
+            <w:r>
+              <w:rPr>
+                <w:rFonts w:ascii="Arial" w:hAnsi="Arial" w:cs="Arial"/>
+                <w:sz w:val="22"/>
+                <w:szCs w:val="22"/>
+              </w:rPr>
+              <w:t>lamp_no</w:t>
+            </w:r>
+            <w:proofErr w:type="spellEnd"/>
+            <w:r>
+              <w:rPr>
+                <w:rFonts w:ascii="Arial" w:hAnsi="Arial" w:cs="Arial"/>
+                <w:sz w:val="22"/>
+                <w:szCs w:val="22"/>
+              </w:rPr>
+              <w:t>}</w:t>
+            </w:r>
+            <w:r>
+              <w:rPr>
+                <w:rFonts w:ascii="Arial" w:hAnsi="Arial" w:cs="Arial"/>
+                <w:sz w:val="22"/>
+                <w:szCs w:val="22"/>
+              </w:rPr>
+              <w:t>.</w:t>
             </w:r>
           </w:p>
         </w:tc>

</xml_diff>

<commit_message>
edit kesalahan KAK dikit
</commit_message>
<xml_diff>
--- a/public/kak-honor-mitra.docx
+++ b/public/kak-honor-mitra.docx
@@ -2998,7 +2998,27 @@
           <w:sz w:val="22"/>
           <w:szCs w:val="22"/>
         </w:rPr>
-        <w:t>Tersalurkannya honorarium petugas lapangan kegiatan SUSENAS.</w:t>
+        <w:t xml:space="preserve">Tersalurkannya honorarium petugas lapangan kegiatan </w:t>
+      </w:r>
+      <w:r>
+        <w:rPr>
+          <w:rFonts w:ascii="Times New Roman" w:hAnsi="Times New Roman"/>
+          <w:bCs/>
+          <w:noProof/>
+          <w:sz w:val="22"/>
+          <w:szCs w:val="22"/>
+        </w:rPr>
+        <w:t>${singkatan_resmi}</w:t>
+      </w:r>
+      <w:r>
+        <w:rPr>
+          <w:rFonts w:ascii="Times New Roman" w:hAnsi="Times New Roman"/>
+          <w:bCs/>
+          <w:noProof/>
+          <w:sz w:val="22"/>
+          <w:szCs w:val="22"/>
+        </w:rPr>
+        <w:t>.</w:t>
       </w:r>
     </w:p>
     <w:p>
@@ -12180,6 +12200,7 @@
   <w:style w:type="character" w:default="1" w:styleId="DefaultParagraphFont">
     <w:name w:val="Default Paragraph Font"/>
     <w:uiPriority w:val="1"/>
+    <w:semiHidden/>
     <w:unhideWhenUsed/>
   </w:style>
   <w:style w:type="table" w:default="1" w:styleId="TableNormal">

</xml_diff>

<commit_message>
update KAK kalimat SK dan kalimat kapital di POK
</commit_message>
<xml_diff>
--- a/public/kak-honor-mitra.docx
+++ b/public/kak-honor-mitra.docx
@@ -3495,7 +3495,57 @@
           <w:sz w:val="22"/>
           <w:szCs w:val="22"/>
         </w:rPr>
-        <w:t>${no_sk} tanggal ${tgl_sk}</w:t>
+        <w:t xml:space="preserve">${no_sk} </w:t>
+      </w:r>
+      <w:r>
+        <w:rPr>
+          <w:rFonts w:ascii="Times New Roman" w:hAnsi="Times New Roman"/>
+          <w:bCs/>
+          <w:noProof/>
+          <w:sz w:val="22"/>
+          <w:szCs w:val="22"/>
+        </w:rPr>
+        <w:t>T</w:t>
+      </w:r>
+      <w:r>
+        <w:rPr>
+          <w:rFonts w:ascii="Times New Roman" w:hAnsi="Times New Roman"/>
+          <w:bCs/>
+          <w:noProof/>
+          <w:sz w:val="22"/>
+          <w:szCs w:val="22"/>
+        </w:rPr>
+        <w:t xml:space="preserve">ahun ${tahun_sk} </w:t>
+      </w:r>
+      <w:r>
+        <w:rPr>
+          <w:rFonts w:ascii="Times New Roman" w:hAnsi="Times New Roman"/>
+          <w:bCs/>
+          <w:noProof/>
+          <w:sz w:val="22"/>
+          <w:szCs w:val="22"/>
+        </w:rPr>
+        <w:t>tanggal ${tgl_sk}</w:t>
+      </w:r>
+      <w:r>
+        <w:rPr>
+          <w:rFonts w:ascii="Times New Roman" w:hAnsi="Times New Roman"/>
+          <w:bCs/>
+          <w:noProof/>
+          <w:sz w:val="22"/>
+          <w:szCs w:val="22"/>
+        </w:rPr>
+        <w:t xml:space="preserve"> </w:t>
+      </w:r>
+      <w:r>
+        <w:rPr>
+          <w:rFonts w:ascii="Times New Roman" w:hAnsi="Times New Roman"/>
+          <w:bCs/>
+          <w:noProof/>
+          <w:sz w:val="22"/>
+          <w:szCs w:val="22"/>
+        </w:rPr>
+        <w:t>perihal ${perihal_sk}</w:t>
       </w:r>
       <w:r>
         <w:rPr>

</xml_diff>

<commit_message>
update tulisan Nomor di SK
</commit_message>
<xml_diff>
--- a/public/kak-honor-mitra.docx
+++ b/public/kak-honor-mitra.docx
@@ -3485,7 +3485,47 @@
           <w:sz w:val="22"/>
           <w:szCs w:val="22"/>
         </w:rPr>
-        <w:t xml:space="preserve"> no </w:t>
+        <w:t xml:space="preserve"> </w:t>
+      </w:r>
+      <w:r>
+        <w:rPr>
+          <w:rFonts w:ascii="Times New Roman" w:hAnsi="Times New Roman"/>
+          <w:bCs/>
+          <w:noProof/>
+          <w:sz w:val="22"/>
+          <w:szCs w:val="22"/>
+        </w:rPr>
+        <w:t>N</w:t>
+      </w:r>
+      <w:r>
+        <w:rPr>
+          <w:rFonts w:ascii="Times New Roman" w:hAnsi="Times New Roman"/>
+          <w:bCs/>
+          <w:noProof/>
+          <w:sz w:val="22"/>
+          <w:szCs w:val="22"/>
+        </w:rPr>
+        <w:t>o</w:t>
+      </w:r>
+      <w:r>
+        <w:rPr>
+          <w:rFonts w:ascii="Times New Roman" w:hAnsi="Times New Roman"/>
+          <w:bCs/>
+          <w:noProof/>
+          <w:sz w:val="22"/>
+          <w:szCs w:val="22"/>
+        </w:rPr>
+        <w:t>mor</w:t>
+      </w:r>
+      <w:r>
+        <w:rPr>
+          <w:rFonts w:ascii="Times New Roman" w:hAnsi="Times New Roman"/>
+          <w:bCs/>
+          <w:noProof/>
+          <w:sz w:val="22"/>
+          <w:szCs w:val="22"/>
+        </w:rPr>
+        <w:t xml:space="preserve"> </w:t>
       </w:r>
       <w:r>
         <w:rPr>

</xml_diff>